<commit_message>
Add an avalanche-noise entropy board as a second RNG source
A 2N3904 emitter-base junction in avalanche at 15 V (MT3608 boost) with
a 2N3904 amplifier on 3V3 feeds GPIO33. Each seed mixes 1024 ADC samples
into the jitter pool and refuses to shuffle (ERROR 5) if they fail a
span / distinct-value health test. The buzzer moves to GPIO12.

CAD: four M2 standoffs under the front base top for the 60 x 40 mm board.
Docs, BOM, wiring diagram and material list updated;  added.

Co-Authored-By: Claude Opus 5.5 <noreply@anthropic.com>
Claude-Session: https://claude.ai/code/session_01Bd8ExgraXFJyhBCFGzjj2S
</commit_message>
<xml_diff>
--- a/docs/material-list.docx
+++ b/docs/material-list.docx
@@ -195,7 +195,7 @@
                 <w:sz w:val="18"/>
                 <w:szCs w:val="18"/>
               </w:rPr>
-              <w:t xml:space="preserve">Shuffler electronics (E1–E25)</w:t>
+              <w:t xml:space="preserve">Shuffler electronics (E1–E29)</w:t>
             </w:r>
           </w:p>
         </w:tc>
@@ -226,7 +226,7 @@
                 <w:sz w:val="18"/>
                 <w:szCs w:val="18"/>
               </w:rPr>
-              <w:t xml:space="preserve">≈ $95</w:t>
+              <w:t xml:space="preserve">≈ $98</w:t>
             </w:r>
           </w:p>
         </w:tc>
@@ -786,7 +786,7 @@
                 <w:sz w:val="18"/>
                 <w:szCs w:val="18"/>
               </w:rPr>
-              <w:t xml:space="preserve">≈ $204</w:t>
+              <w:t xml:space="preserve">≈ $207</w:t>
             </w:r>
           </w:p>
         </w:tc>
@@ -838,7 +838,7 @@
         <w:t xml:space="preserve">Already have some of it? </w:t>
       </w:r>
       <w:r>
-        <w:t xml:space="preserve">A parts drawer with resistors, capacitors, perfboard/wire and M3 screws (E22–E24, M5) saves about $18. Skateboard bearings work for E6. Pen springs (M7) and dead AA cells (M8) are scrap.</w:t>
+        <w:t xml:space="preserve">A parts drawer with resistors, capacitors, perfboard/wire and M3 screws (E22–E24, E28, M5) saves about $19. Skateboard bearings work for E6. Pen springs (M7) and dead AA cells (M8) are scrap.</w:t>
       </w:r>
     </w:p>
     <w:p>
@@ -8666,6 +8666,860 @@
         </w:tc>
       </w:tr>
       <w:tr>
+        <w:trPr>
+          <w:cantSplit/>
+        </w:trPr>
+        <w:tc>
+          <w:tcPr>
+            <w:tcW w:type="dxa" w:w="380"/>
+            <w:tcBorders>
+              <w:top w:val="single" w:color="BFBFBF" w:sz="4"/>
+              <w:left w:val="single" w:color="BFBFBF" w:sz="4"/>
+              <w:bottom w:val="single" w:color="BFBFBF" w:sz="4"/>
+              <w:right w:val="single" w:color="BFBFBF" w:sz="4"/>
+            </w:tcBorders>
+            <w:tcMar>
+              <w:top w:type="dxa" w:w="50"/>
+              <w:left w:type="dxa" w:w="80"/>
+              <w:bottom w:type="dxa" w:w="50"/>
+              <w:right w:type="dxa" w:w="80"/>
+            </w:tcMar>
+          </w:tcPr>
+          <w:p>
+            <w:pPr>
+              <w:jc w:val="center"/>
+            </w:pPr>
+            <w:r>
+              <w:rPr>
+                <w:b w:val="false"/>
+                <w:bCs w:val="false"/>
+                <w:sz w:val="18"/>
+                <w:szCs w:val="18"/>
+              </w:rPr>
+              <w:t xml:space="preserve">☐</w:t>
+            </w:r>
+          </w:p>
+        </w:tc>
+        <w:tc>
+          <w:tcPr>
+            <w:tcW w:type="dxa" w:w="520"/>
+            <w:tcBorders>
+              <w:top w:val="single" w:color="BFBFBF" w:sz="4"/>
+              <w:left w:val="single" w:color="BFBFBF" w:sz="4"/>
+              <w:bottom w:val="single" w:color="BFBFBF" w:sz="4"/>
+              <w:right w:val="single" w:color="BFBFBF" w:sz="4"/>
+            </w:tcBorders>
+            <w:tcMar>
+              <w:top w:type="dxa" w:w="50"/>
+              <w:left w:type="dxa" w:w="80"/>
+              <w:bottom w:type="dxa" w:w="50"/>
+              <w:right w:type="dxa" w:w="80"/>
+            </w:tcMar>
+          </w:tcPr>
+          <w:p>
+            <w:r>
+              <w:rPr>
+                <w:b w:val="false"/>
+                <w:bCs w:val="false"/>
+                <w:sz w:val="18"/>
+                <w:szCs w:val="18"/>
+              </w:rPr>
+              <w:t xml:space="preserve">E26</w:t>
+            </w:r>
+          </w:p>
+        </w:tc>
+        <w:tc>
+          <w:tcPr>
+            <w:tcW w:type="dxa" w:w="2700"/>
+            <w:tcBorders>
+              <w:top w:val="single" w:color="BFBFBF" w:sz="4"/>
+              <w:left w:val="single" w:color="BFBFBF" w:sz="4"/>
+              <w:bottom w:val="single" w:color="BFBFBF" w:sz="4"/>
+              <w:right w:val="single" w:color="BFBFBF" w:sz="4"/>
+            </w:tcBorders>
+            <w:tcMar>
+              <w:top w:type="dxa" w:w="50"/>
+              <w:left w:type="dxa" w:w="80"/>
+              <w:bottom w:type="dxa" w:w="50"/>
+              <w:right w:type="dxa" w:w="80"/>
+            </w:tcMar>
+          </w:tcPr>
+          <w:p>
+            <w:r>
+              <w:rPr>
+                <w:b w:val="false"/>
+                <w:bCs w:val="false"/>
+                <w:sz w:val="18"/>
+                <w:szCs w:val="18"/>
+              </w:rPr>
+              <w:t xml:space="preserve">MT3608 boost module (noise board)</w:t>
+            </w:r>
+          </w:p>
+        </w:tc>
+        <w:tc>
+          <w:tcPr>
+            <w:tcW w:type="dxa" w:w="560"/>
+            <w:tcBorders>
+              <w:top w:val="single" w:color="BFBFBF" w:sz="4"/>
+              <w:left w:val="single" w:color="BFBFBF" w:sz="4"/>
+              <w:bottom w:val="single" w:color="BFBFBF" w:sz="4"/>
+              <w:right w:val="single" w:color="BFBFBF" w:sz="4"/>
+            </w:tcBorders>
+            <w:tcMar>
+              <w:top w:type="dxa" w:w="50"/>
+              <w:left w:type="dxa" w:w="80"/>
+              <w:bottom w:type="dxa" w:w="50"/>
+              <w:right w:type="dxa" w:w="80"/>
+            </w:tcMar>
+          </w:tcPr>
+          <w:p>
+            <w:pPr>
+              <w:jc w:val="center"/>
+            </w:pPr>
+            <w:r>
+              <w:rPr>
+                <w:b w:val="false"/>
+                <w:bCs w:val="false"/>
+                <w:sz w:val="18"/>
+                <w:szCs w:val="18"/>
+              </w:rPr>
+              <w:t xml:space="preserve">1</w:t>
+            </w:r>
+          </w:p>
+        </w:tc>
+        <w:tc>
+          <w:tcPr>
+            <w:tcW w:type="dxa" w:w="3040"/>
+            <w:tcBorders>
+              <w:top w:val="single" w:color="BFBFBF" w:sz="4"/>
+              <w:left w:val="single" w:color="BFBFBF" w:sz="4"/>
+              <w:bottom w:val="single" w:color="BFBFBF" w:sz="4"/>
+              <w:right w:val="single" w:color="BFBFBF" w:sz="4"/>
+            </w:tcBorders>
+            <w:tcMar>
+              <w:top w:type="dxa" w:w="50"/>
+              <w:left w:type="dxa" w:w="80"/>
+              <w:bottom w:type="dxa" w:w="50"/>
+              <w:right w:type="dxa" w:w="80"/>
+            </w:tcMar>
+          </w:tcPr>
+          <w:p>
+            <w:r>
+              <w:rPr>
+                <w:b w:val="false"/>
+                <w:bCs w:val="false"/>
+                <w:sz w:val="18"/>
+                <w:szCs w:val="18"/>
+              </w:rPr>
+              <w:t xml:space="preserve">2-24 V in, adjustable, set to 15.0 V</w:t>
+            </w:r>
+          </w:p>
+        </w:tc>
+        <w:tc>
+          <w:tcPr>
+            <w:tcW w:type="dxa" w:w="760"/>
+            <w:tcBorders>
+              <w:top w:val="single" w:color="BFBFBF" w:sz="4"/>
+              <w:left w:val="single" w:color="BFBFBF" w:sz="4"/>
+              <w:bottom w:val="single" w:color="BFBFBF" w:sz="4"/>
+              <w:right w:val="single" w:color="BFBFBF" w:sz="4"/>
+            </w:tcBorders>
+            <w:tcMar>
+              <w:top w:type="dxa" w:w="50"/>
+              <w:left w:type="dxa" w:w="80"/>
+              <w:bottom w:type="dxa" w:w="50"/>
+              <w:right w:type="dxa" w:w="80"/>
+            </w:tcMar>
+          </w:tcPr>
+          <w:p>
+            <w:pPr>
+              <w:jc w:val="right"/>
+            </w:pPr>
+            <w:r>
+              <w:rPr>
+                <w:b w:val="false"/>
+                <w:bCs w:val="false"/>
+                <w:sz w:val="18"/>
+                <w:szCs w:val="18"/>
+              </w:rPr>
+              <w:t xml:space="preserve">$1</w:t>
+            </w:r>
+          </w:p>
+        </w:tc>
+        <w:tc>
+          <w:tcPr>
+            <w:tcW w:type="dxa" w:w="2840"/>
+            <w:tcBorders>
+              <w:top w:val="single" w:color="BFBFBF" w:sz="4"/>
+              <w:left w:val="single" w:color="BFBFBF" w:sz="4"/>
+              <w:bottom w:val="single" w:color="BFBFBF" w:sz="4"/>
+              <w:right w:val="single" w:color="BFBFBF" w:sz="4"/>
+            </w:tcBorders>
+            <w:tcMar>
+              <w:top w:type="dxa" w:w="50"/>
+              <w:left w:type="dxa" w:w="80"/>
+              <w:bottom w:type="dxa" w:w="50"/>
+              <w:right w:type="dxa" w:w="80"/>
+            </w:tcMar>
+          </w:tcPr>
+          <w:p>
+            <w:r>
+              <w:rPr>
+                <w:b w:val="false"/>
+                <w:bCs w:val="false"/>
+                <w:sz w:val="18"/>
+                <w:szCs w:val="18"/>
+              </w:rPr>
+              <w:t xml:space="preserve">Alt: any small adjustable boost to 12-18 V</w:t>
+            </w:r>
+          </w:p>
+        </w:tc>
+      </w:tr>
+      <w:tr>
+        <w:trPr>
+          <w:cantSplit/>
+        </w:trPr>
+        <w:tc>
+          <w:tcPr>
+            <w:tcW w:type="dxa" w:w="380"/>
+            <w:tcBorders>
+              <w:top w:val="single" w:color="BFBFBF" w:sz="4"/>
+              <w:left w:val="single" w:color="BFBFBF" w:sz="4"/>
+              <w:bottom w:val="single" w:color="BFBFBF" w:sz="4"/>
+              <w:right w:val="single" w:color="BFBFBF" w:sz="4"/>
+            </w:tcBorders>
+            <w:shd w:fill="F5F8FB" w:color="auto" w:val="clear"/>
+            <w:tcMar>
+              <w:top w:type="dxa" w:w="50"/>
+              <w:left w:type="dxa" w:w="80"/>
+              <w:bottom w:type="dxa" w:w="50"/>
+              <w:right w:type="dxa" w:w="80"/>
+            </w:tcMar>
+          </w:tcPr>
+          <w:p>
+            <w:pPr>
+              <w:jc w:val="center"/>
+            </w:pPr>
+            <w:r>
+              <w:rPr>
+                <w:b w:val="false"/>
+                <w:bCs w:val="false"/>
+                <w:sz w:val="18"/>
+                <w:szCs w:val="18"/>
+              </w:rPr>
+              <w:t xml:space="preserve">☐</w:t>
+            </w:r>
+          </w:p>
+        </w:tc>
+        <w:tc>
+          <w:tcPr>
+            <w:tcW w:type="dxa" w:w="520"/>
+            <w:tcBorders>
+              <w:top w:val="single" w:color="BFBFBF" w:sz="4"/>
+              <w:left w:val="single" w:color="BFBFBF" w:sz="4"/>
+              <w:bottom w:val="single" w:color="BFBFBF" w:sz="4"/>
+              <w:right w:val="single" w:color="BFBFBF" w:sz="4"/>
+            </w:tcBorders>
+            <w:shd w:fill="F5F8FB" w:color="auto" w:val="clear"/>
+            <w:tcMar>
+              <w:top w:type="dxa" w:w="50"/>
+              <w:left w:type="dxa" w:w="80"/>
+              <w:bottom w:type="dxa" w:w="50"/>
+              <w:right w:type="dxa" w:w="80"/>
+            </w:tcMar>
+          </w:tcPr>
+          <w:p>
+            <w:r>
+              <w:rPr>
+                <w:b w:val="false"/>
+                <w:bCs w:val="false"/>
+                <w:sz w:val="18"/>
+                <w:szCs w:val="18"/>
+              </w:rPr>
+              <w:t xml:space="preserve">E27</w:t>
+            </w:r>
+          </w:p>
+        </w:tc>
+        <w:tc>
+          <w:tcPr>
+            <w:tcW w:type="dxa" w:w="2700"/>
+            <w:tcBorders>
+              <w:top w:val="single" w:color="BFBFBF" w:sz="4"/>
+              <w:left w:val="single" w:color="BFBFBF" w:sz="4"/>
+              <w:bottom w:val="single" w:color="BFBFBF" w:sz="4"/>
+              <w:right w:val="single" w:color="BFBFBF" w:sz="4"/>
+            </w:tcBorders>
+            <w:shd w:fill="F5F8FB" w:color="auto" w:val="clear"/>
+            <w:tcMar>
+              <w:top w:type="dxa" w:w="50"/>
+              <w:left w:type="dxa" w:w="80"/>
+              <w:bottom w:type="dxa" w:w="50"/>
+              <w:right w:type="dxa" w:w="80"/>
+            </w:tcMar>
+          </w:tcPr>
+          <w:p>
+            <w:r>
+              <w:rPr>
+                <w:b w:val="false"/>
+                <w:bCs w:val="false"/>
+                <w:sz w:val="18"/>
+                <w:szCs w:val="18"/>
+              </w:rPr>
+              <w:t xml:space="preserve">2N3904 NPN transistor (noise board)</w:t>
+            </w:r>
+          </w:p>
+        </w:tc>
+        <w:tc>
+          <w:tcPr>
+            <w:tcW w:type="dxa" w:w="560"/>
+            <w:tcBorders>
+              <w:top w:val="single" w:color="BFBFBF" w:sz="4"/>
+              <w:left w:val="single" w:color="BFBFBF" w:sz="4"/>
+              <w:bottom w:val="single" w:color="BFBFBF" w:sz="4"/>
+              <w:right w:val="single" w:color="BFBFBF" w:sz="4"/>
+            </w:tcBorders>
+            <w:shd w:fill="F5F8FB" w:color="auto" w:val="clear"/>
+            <w:tcMar>
+              <w:top w:type="dxa" w:w="50"/>
+              <w:left w:type="dxa" w:w="80"/>
+              <w:bottom w:type="dxa" w:w="50"/>
+              <w:right w:type="dxa" w:w="80"/>
+            </w:tcMar>
+          </w:tcPr>
+          <w:p>
+            <w:pPr>
+              <w:jc w:val="center"/>
+            </w:pPr>
+            <w:r>
+              <w:rPr>
+                <w:b w:val="false"/>
+                <w:bCs w:val="false"/>
+                <w:sz w:val="18"/>
+                <w:szCs w:val="18"/>
+              </w:rPr>
+              <w:t xml:space="preserve">2</w:t>
+            </w:r>
+          </w:p>
+        </w:tc>
+        <w:tc>
+          <w:tcPr>
+            <w:tcW w:type="dxa" w:w="3040"/>
+            <w:tcBorders>
+              <w:top w:val="single" w:color="BFBFBF" w:sz="4"/>
+              <w:left w:val="single" w:color="BFBFBF" w:sz="4"/>
+              <w:bottom w:val="single" w:color="BFBFBF" w:sz="4"/>
+              <w:right w:val="single" w:color="BFBFBF" w:sz="4"/>
+            </w:tcBorders>
+            <w:shd w:fill="F5F8FB" w:color="auto" w:val="clear"/>
+            <w:tcMar>
+              <w:top w:type="dxa" w:w="50"/>
+              <w:left w:type="dxa" w:w="80"/>
+              <w:bottom w:type="dxa" w:w="50"/>
+              <w:right w:type="dxa" w:w="80"/>
+            </w:tcMar>
+          </w:tcPr>
+          <w:p>
+            <w:r>
+              <w:rPr>
+                <w:b w:val="false"/>
+                <w:bCs w:val="false"/>
+                <w:sz w:val="18"/>
+                <w:szCs w:val="18"/>
+              </w:rPr>
+              <w:t xml:space="preserve">TO-92; Q1 avalanche junction, Q2 amplifier</w:t>
+            </w:r>
+          </w:p>
+        </w:tc>
+        <w:tc>
+          <w:tcPr>
+            <w:tcW w:type="dxa" w:w="760"/>
+            <w:tcBorders>
+              <w:top w:val="single" w:color="BFBFBF" w:sz="4"/>
+              <w:left w:val="single" w:color="BFBFBF" w:sz="4"/>
+              <w:bottom w:val="single" w:color="BFBFBF" w:sz="4"/>
+              <w:right w:val="single" w:color="BFBFBF" w:sz="4"/>
+            </w:tcBorders>
+            <w:shd w:fill="F5F8FB" w:color="auto" w:val="clear"/>
+            <w:tcMar>
+              <w:top w:type="dxa" w:w="50"/>
+              <w:left w:type="dxa" w:w="80"/>
+              <w:bottom w:type="dxa" w:w="50"/>
+              <w:right w:type="dxa" w:w="80"/>
+            </w:tcMar>
+          </w:tcPr>
+          <w:p>
+            <w:pPr>
+              <w:jc w:val="right"/>
+            </w:pPr>
+            <w:r>
+              <w:rPr>
+                <w:b w:val="false"/>
+                <w:bCs w:val="false"/>
+                <w:sz w:val="18"/>
+                <w:szCs w:val="18"/>
+              </w:rPr>
+              <w:t xml:space="preserve">$0.20</w:t>
+            </w:r>
+          </w:p>
+        </w:tc>
+        <w:tc>
+          <w:tcPr>
+            <w:tcW w:type="dxa" w:w="2840"/>
+            <w:tcBorders>
+              <w:top w:val="single" w:color="BFBFBF" w:sz="4"/>
+              <w:left w:val="single" w:color="BFBFBF" w:sz="4"/>
+              <w:bottom w:val="single" w:color="BFBFBF" w:sz="4"/>
+              <w:right w:val="single" w:color="BFBFBF" w:sz="4"/>
+            </w:tcBorders>
+            <w:shd w:fill="F5F8FB" w:color="auto" w:val="clear"/>
+            <w:tcMar>
+              <w:top w:type="dxa" w:w="50"/>
+              <w:left w:type="dxa" w:w="80"/>
+              <w:bottom w:type="dxa" w:w="50"/>
+              <w:right w:type="dxa" w:w="80"/>
+            </w:tcMar>
+          </w:tcPr>
+          <w:p>
+            <w:r>
+              <w:rPr>
+                <w:b w:val="false"/>
+                <w:bCs w:val="false"/>
+                <w:sz w:val="18"/>
+                <w:szCs w:val="18"/>
+              </w:rPr>
+              <w:t xml:space="preserve">Alt: BC547 (check its E-B breakdown)</w:t>
+            </w:r>
+          </w:p>
+        </w:tc>
+      </w:tr>
+      <w:tr>
+        <w:trPr>
+          <w:cantSplit/>
+        </w:trPr>
+        <w:tc>
+          <w:tcPr>
+            <w:tcW w:type="dxa" w:w="380"/>
+            <w:tcBorders>
+              <w:top w:val="single" w:color="BFBFBF" w:sz="4"/>
+              <w:left w:val="single" w:color="BFBFBF" w:sz="4"/>
+              <w:bottom w:val="single" w:color="BFBFBF" w:sz="4"/>
+              <w:right w:val="single" w:color="BFBFBF" w:sz="4"/>
+            </w:tcBorders>
+            <w:tcMar>
+              <w:top w:type="dxa" w:w="50"/>
+              <w:left w:type="dxa" w:w="80"/>
+              <w:bottom w:type="dxa" w:w="50"/>
+              <w:right w:type="dxa" w:w="80"/>
+            </w:tcMar>
+          </w:tcPr>
+          <w:p>
+            <w:pPr>
+              <w:jc w:val="center"/>
+            </w:pPr>
+            <w:r>
+              <w:rPr>
+                <w:b w:val="false"/>
+                <w:bCs w:val="false"/>
+                <w:sz w:val="18"/>
+                <w:szCs w:val="18"/>
+              </w:rPr>
+              <w:t xml:space="preserve">☐</w:t>
+            </w:r>
+          </w:p>
+        </w:tc>
+        <w:tc>
+          <w:tcPr>
+            <w:tcW w:type="dxa" w:w="520"/>
+            <w:tcBorders>
+              <w:top w:val="single" w:color="BFBFBF" w:sz="4"/>
+              <w:left w:val="single" w:color="BFBFBF" w:sz="4"/>
+              <w:bottom w:val="single" w:color="BFBFBF" w:sz="4"/>
+              <w:right w:val="single" w:color="BFBFBF" w:sz="4"/>
+            </w:tcBorders>
+            <w:tcMar>
+              <w:top w:type="dxa" w:w="50"/>
+              <w:left w:type="dxa" w:w="80"/>
+              <w:bottom w:type="dxa" w:w="50"/>
+              <w:right w:type="dxa" w:w="80"/>
+            </w:tcMar>
+          </w:tcPr>
+          <w:p>
+            <w:r>
+              <w:rPr>
+                <w:b w:val="false"/>
+                <w:bCs w:val="false"/>
+                <w:sz w:val="18"/>
+                <w:szCs w:val="18"/>
+              </w:rPr>
+              <w:t xml:space="preserve">E28</w:t>
+            </w:r>
+          </w:p>
+        </w:tc>
+        <w:tc>
+          <w:tcPr>
+            <w:tcW w:type="dxa" w:w="2700"/>
+            <w:tcBorders>
+              <w:top w:val="single" w:color="BFBFBF" w:sz="4"/>
+              <w:left w:val="single" w:color="BFBFBF" w:sz="4"/>
+              <w:bottom w:val="single" w:color="BFBFBF" w:sz="4"/>
+              <w:right w:val="single" w:color="BFBFBF" w:sz="4"/>
+            </w:tcBorders>
+            <w:tcMar>
+              <w:top w:type="dxa" w:w="50"/>
+              <w:left w:type="dxa" w:w="80"/>
+              <w:bottom w:type="dxa" w:w="50"/>
+              <w:right w:type="dxa" w:w="80"/>
+            </w:tcMar>
+          </w:tcPr>
+          <w:p>
+            <w:r>
+              <w:rPr>
+                <w:b w:val="false"/>
+                <w:bCs w:val="false"/>
+                <w:sz w:val="18"/>
+                <w:szCs w:val="18"/>
+              </w:rPr>
+              <w:t xml:space="preserve">Noise board passives</w:t>
+            </w:r>
+          </w:p>
+        </w:tc>
+        <w:tc>
+          <w:tcPr>
+            <w:tcW w:type="dxa" w:w="560"/>
+            <w:tcBorders>
+              <w:top w:val="single" w:color="BFBFBF" w:sz="4"/>
+              <w:left w:val="single" w:color="BFBFBF" w:sz="4"/>
+              <w:bottom w:val="single" w:color="BFBFBF" w:sz="4"/>
+              <w:right w:val="single" w:color="BFBFBF" w:sz="4"/>
+            </w:tcBorders>
+            <w:tcMar>
+              <w:top w:type="dxa" w:w="50"/>
+              <w:left w:type="dxa" w:w="80"/>
+              <w:bottom w:type="dxa" w:w="50"/>
+              <w:right w:type="dxa" w:w="80"/>
+            </w:tcMar>
+          </w:tcPr>
+          <w:p>
+            <w:pPr>
+              <w:jc w:val="center"/>
+            </w:pPr>
+            <w:r>
+              <w:rPr>
+                <w:b w:val="false"/>
+                <w:bCs w:val="false"/>
+                <w:sz w:val="18"/>
+                <w:szCs w:val="18"/>
+              </w:rPr>
+              <w:t xml:space="preserve">1</w:t>
+            </w:r>
+          </w:p>
+        </w:tc>
+        <w:tc>
+          <w:tcPr>
+            <w:tcW w:type="dxa" w:w="3040"/>
+            <w:tcBorders>
+              <w:top w:val="single" w:color="BFBFBF" w:sz="4"/>
+              <w:left w:val="single" w:color="BFBFBF" w:sz="4"/>
+              <w:bottom w:val="single" w:color="BFBFBF" w:sz="4"/>
+              <w:right w:val="single" w:color="BFBFBF" w:sz="4"/>
+            </w:tcBorders>
+            <w:tcMar>
+              <w:top w:type="dxa" w:w="50"/>
+              <w:left w:type="dxa" w:w="80"/>
+              <w:bottom w:type="dxa" w:w="50"/>
+              <w:right w:type="dxa" w:w="80"/>
+            </w:tcMar>
+          </w:tcPr>
+          <w:p>
+            <w:r>
+              <w:rPr>
+                <w:b w:val="false"/>
+                <w:bCs w:val="false"/>
+                <w:sz w:val="18"/>
+                <w:szCs w:val="18"/>
+              </w:rPr>
+              <w:t xml:space="preserve">22 k, 4.7 k, 470 k, 1 k, 100 ohm; 100 nF; 10 uF 25 V x2</w:t>
+            </w:r>
+          </w:p>
+        </w:tc>
+        <w:tc>
+          <w:tcPr>
+            <w:tcW w:type="dxa" w:w="760"/>
+            <w:tcBorders>
+              <w:top w:val="single" w:color="BFBFBF" w:sz="4"/>
+              <w:left w:val="single" w:color="BFBFBF" w:sz="4"/>
+              <w:bottom w:val="single" w:color="BFBFBF" w:sz="4"/>
+              <w:right w:val="single" w:color="BFBFBF" w:sz="4"/>
+            </w:tcBorders>
+            <w:tcMar>
+              <w:top w:type="dxa" w:w="50"/>
+              <w:left w:type="dxa" w:w="80"/>
+              <w:bottom w:type="dxa" w:w="50"/>
+              <w:right w:type="dxa" w:w="80"/>
+            </w:tcMar>
+          </w:tcPr>
+          <w:p>
+            <w:pPr>
+              <w:jc w:val="right"/>
+            </w:pPr>
+            <w:r>
+              <w:rPr>
+                <w:b w:val="false"/>
+                <w:bCs w:val="false"/>
+                <w:sz w:val="18"/>
+                <w:szCs w:val="18"/>
+              </w:rPr>
+              <w:t xml:space="preserve">$0.50</w:t>
+            </w:r>
+          </w:p>
+        </w:tc>
+        <w:tc>
+          <w:tcPr>
+            <w:tcW w:type="dxa" w:w="2840"/>
+            <w:tcBorders>
+              <w:top w:val="single" w:color="BFBFBF" w:sz="4"/>
+              <w:left w:val="single" w:color="BFBFBF" w:sz="4"/>
+              <w:bottom w:val="single" w:color="BFBFBF" w:sz="4"/>
+              <w:right w:val="single" w:color="BFBFBF" w:sz="4"/>
+            </w:tcBorders>
+            <w:tcMar>
+              <w:top w:type="dxa" w:w="50"/>
+              <w:left w:type="dxa" w:w="80"/>
+              <w:bottom w:type="dxa" w:w="50"/>
+              <w:right w:type="dxa" w:w="80"/>
+            </w:tcMar>
+          </w:tcPr>
+          <w:p>
+            <w:r>
+              <w:rPr>
+                <w:b w:val="false"/>
+                <w:bCs w:val="false"/>
+                <w:sz w:val="18"/>
+                <w:szCs w:val="18"/>
+              </w:rPr>
+              <w:t xml:space="preserve"/>
+            </w:r>
+          </w:p>
+        </w:tc>
+      </w:tr>
+      <w:tr>
+        <w:trPr>
+          <w:cantSplit/>
+        </w:trPr>
+        <w:tc>
+          <w:tcPr>
+            <w:tcW w:type="dxa" w:w="380"/>
+            <w:tcBorders>
+              <w:top w:val="single" w:color="BFBFBF" w:sz="4"/>
+              <w:left w:val="single" w:color="BFBFBF" w:sz="4"/>
+              <w:bottom w:val="single" w:color="BFBFBF" w:sz="4"/>
+              <w:right w:val="single" w:color="BFBFBF" w:sz="4"/>
+            </w:tcBorders>
+            <w:shd w:fill="F5F8FB" w:color="auto" w:val="clear"/>
+            <w:tcMar>
+              <w:top w:type="dxa" w:w="50"/>
+              <w:left w:type="dxa" w:w="80"/>
+              <w:bottom w:type="dxa" w:w="50"/>
+              <w:right w:type="dxa" w:w="80"/>
+            </w:tcMar>
+          </w:tcPr>
+          <w:p>
+            <w:pPr>
+              <w:jc w:val="center"/>
+            </w:pPr>
+            <w:r>
+              <w:rPr>
+                <w:b w:val="false"/>
+                <w:bCs w:val="false"/>
+                <w:sz w:val="18"/>
+                <w:szCs w:val="18"/>
+              </w:rPr>
+              <w:t xml:space="preserve">☐</w:t>
+            </w:r>
+          </w:p>
+        </w:tc>
+        <w:tc>
+          <w:tcPr>
+            <w:tcW w:type="dxa" w:w="520"/>
+            <w:tcBorders>
+              <w:top w:val="single" w:color="BFBFBF" w:sz="4"/>
+              <w:left w:val="single" w:color="BFBFBF" w:sz="4"/>
+              <w:bottom w:val="single" w:color="BFBFBF" w:sz="4"/>
+              <w:right w:val="single" w:color="BFBFBF" w:sz="4"/>
+            </w:tcBorders>
+            <w:shd w:fill="F5F8FB" w:color="auto" w:val="clear"/>
+            <w:tcMar>
+              <w:top w:type="dxa" w:w="50"/>
+              <w:left w:type="dxa" w:w="80"/>
+              <w:bottom w:type="dxa" w:w="50"/>
+              <w:right w:type="dxa" w:w="80"/>
+            </w:tcMar>
+          </w:tcPr>
+          <w:p>
+            <w:r>
+              <w:rPr>
+                <w:b w:val="false"/>
+                <w:bCs w:val="false"/>
+                <w:sz w:val="18"/>
+                <w:szCs w:val="18"/>
+              </w:rPr>
+              <w:t xml:space="preserve">E29</w:t>
+            </w:r>
+          </w:p>
+        </w:tc>
+        <w:tc>
+          <w:tcPr>
+            <w:tcW w:type="dxa" w:w="2700"/>
+            <w:tcBorders>
+              <w:top w:val="single" w:color="BFBFBF" w:sz="4"/>
+              <w:left w:val="single" w:color="BFBFBF" w:sz="4"/>
+              <w:bottom w:val="single" w:color="BFBFBF" w:sz="4"/>
+              <w:right w:val="single" w:color="BFBFBF" w:sz="4"/>
+            </w:tcBorders>
+            <w:shd w:fill="F5F8FB" w:color="auto" w:val="clear"/>
+            <w:tcMar>
+              <w:top w:type="dxa" w:w="50"/>
+              <w:left w:type="dxa" w:w="80"/>
+              <w:bottom w:type="dxa" w:w="50"/>
+              <w:right w:type="dxa" w:w="80"/>
+            </w:tcMar>
+          </w:tcPr>
+          <w:p>
+            <w:r>
+              <w:rPr>
+                <w:b w:val="false"/>
+                <w:bCs w:val="false"/>
+                <w:sz w:val="18"/>
+                <w:szCs w:val="18"/>
+              </w:rPr>
+              <w:t xml:space="preserve">Perfboard 60 x 40 mm (noise board)</w:t>
+            </w:r>
+          </w:p>
+        </w:tc>
+        <w:tc>
+          <w:tcPr>
+            <w:tcW w:type="dxa" w:w="560"/>
+            <w:tcBorders>
+              <w:top w:val="single" w:color="BFBFBF" w:sz="4"/>
+              <w:left w:val="single" w:color="BFBFBF" w:sz="4"/>
+              <w:bottom w:val="single" w:color="BFBFBF" w:sz="4"/>
+              <w:right w:val="single" w:color="BFBFBF" w:sz="4"/>
+            </w:tcBorders>
+            <w:shd w:fill="F5F8FB" w:color="auto" w:val="clear"/>
+            <w:tcMar>
+              <w:top w:type="dxa" w:w="50"/>
+              <w:left w:type="dxa" w:w="80"/>
+              <w:bottom w:type="dxa" w:w="50"/>
+              <w:right w:type="dxa" w:w="80"/>
+            </w:tcMar>
+          </w:tcPr>
+          <w:p>
+            <w:pPr>
+              <w:jc w:val="center"/>
+            </w:pPr>
+            <w:r>
+              <w:rPr>
+                <w:b w:val="false"/>
+                <w:bCs w:val="false"/>
+                <w:sz w:val="18"/>
+                <w:szCs w:val="18"/>
+              </w:rPr>
+              <w:t xml:space="preserve">1</w:t>
+            </w:r>
+          </w:p>
+        </w:tc>
+        <w:tc>
+          <w:tcPr>
+            <w:tcW w:type="dxa" w:w="3040"/>
+            <w:tcBorders>
+              <w:top w:val="single" w:color="BFBFBF" w:sz="4"/>
+              <w:left w:val="single" w:color="BFBFBF" w:sz="4"/>
+              <w:bottom w:val="single" w:color="BFBFBF" w:sz="4"/>
+              <w:right w:val="single" w:color="BFBFBF" w:sz="4"/>
+            </w:tcBorders>
+            <w:shd w:fill="F5F8FB" w:color="auto" w:val="clear"/>
+            <w:tcMar>
+              <w:top w:type="dxa" w:w="50"/>
+              <w:left w:type="dxa" w:w="80"/>
+              <w:bottom w:type="dxa" w:w="50"/>
+              <w:right w:type="dxa" w:w="80"/>
+            </w:tcMar>
+          </w:tcPr>
+          <w:p>
+            <w:r>
+              <w:rPr>
+                <w:b w:val="false"/>
+                <w:bCs w:val="false"/>
+                <w:sz w:val="18"/>
+                <w:szCs w:val="18"/>
+              </w:rPr>
+              <w:t xml:space="preserve">2.54 mm pitch, corner holes for M2 (56 x 36 mm pitch)</w:t>
+            </w:r>
+          </w:p>
+        </w:tc>
+        <w:tc>
+          <w:tcPr>
+            <w:tcW w:type="dxa" w:w="760"/>
+            <w:tcBorders>
+              <w:top w:val="single" w:color="BFBFBF" w:sz="4"/>
+              <w:left w:val="single" w:color="BFBFBF" w:sz="4"/>
+              <w:bottom w:val="single" w:color="BFBFBF" w:sz="4"/>
+              <w:right w:val="single" w:color="BFBFBF" w:sz="4"/>
+            </w:tcBorders>
+            <w:shd w:fill="F5F8FB" w:color="auto" w:val="clear"/>
+            <w:tcMar>
+              <w:top w:type="dxa" w:w="50"/>
+              <w:left w:type="dxa" w:w="80"/>
+              <w:bottom w:type="dxa" w:w="50"/>
+              <w:right w:type="dxa" w:w="80"/>
+            </w:tcMar>
+          </w:tcPr>
+          <w:p>
+            <w:pPr>
+              <w:jc w:val="right"/>
+            </w:pPr>
+            <w:r>
+              <w:rPr>
+                <w:b w:val="false"/>
+                <w:bCs w:val="false"/>
+                <w:sz w:val="18"/>
+                <w:szCs w:val="18"/>
+              </w:rPr>
+              <w:t xml:space="preserve">$1</w:t>
+            </w:r>
+          </w:p>
+        </w:tc>
+        <w:tc>
+          <w:tcPr>
+            <w:tcW w:type="dxa" w:w="2840"/>
+            <w:tcBorders>
+              <w:top w:val="single" w:color="BFBFBF" w:sz="4"/>
+              <w:left w:val="single" w:color="BFBFBF" w:sz="4"/>
+              <w:bottom w:val="single" w:color="BFBFBF" w:sz="4"/>
+              <w:right w:val="single" w:color="BFBFBF" w:sz="4"/>
+            </w:tcBorders>
+            <w:shd w:fill="F5F8FB" w:color="auto" w:val="clear"/>
+            <w:tcMar>
+              <w:top w:type="dxa" w:w="50"/>
+              <w:left w:type="dxa" w:w="80"/>
+              <w:bottom w:type="dxa" w:w="50"/>
+              <w:right w:type="dxa" w:w="80"/>
+            </w:tcMar>
+          </w:tcPr>
+          <w:p>
+            <w:r>
+              <w:rPr>
+                <w:b w:val="false"/>
+                <w:bCs w:val="false"/>
+                <w:sz w:val="18"/>
+                <w:szCs w:val="18"/>
+              </w:rPr>
+              <w:t xml:space="preserve">Alt: cut from a larger board</w:t>
+            </w:r>
+          </w:p>
+        </w:tc>
+      </w:tr>
+      <w:tr>
         <w:tc>
           <w:tcPr>
             <w:tcW w:type="dxa" w:w="380"/>
@@ -8845,7 +9699,7 @@
                 <w:sz w:val="18"/>
                 <w:szCs w:val="18"/>
               </w:rPr>
-              <w:t xml:space="preserve">≈ $95</w:t>
+              <w:t xml:space="preserve">≈ $98</w:t>
             </w:r>
           </w:p>
         </w:tc>
@@ -8929,6 +9783,19 @@
         <w:spacing w:after="60"/>
       </w:pPr>
       <w:r>
+        <w:t xml:space="preserve">Noise board (E26–E29): the avalanche random source. Optional; without it set USE_AVALANCHE 0 in the firmware.</w:t>
+      </w:r>
+    </w:p>
+    <w:p>
+      <w:pPr>
+        <w:pStyle w:val="ListParagraph"/>
+        <w:numPr>
+          <w:ilvl w:val="0"/>
+          <w:numId w:val="2"/>
+        </w:numPr>
+        <w:spacing w:after="60"/>
+      </w:pPr>
+      <w:r>
         <w:t xml:space="preserve">Battery (E10): it must fit in 75 × 60 × 22 mm and have a BMS rated for at least 5 A.</w:t>
       </w:r>
     </w:p>
@@ -8942,7 +9809,7 @@
         <w:spacing w:after="60"/>
       </w:pPr>
       <w:r>
-        <w:t xml:space="preserve">Cheapest build: A4988 instead of TMC2208, SG90 instead of MG90S, 17HS4023 motor, skate bearings: about $88 total parts.</w:t>
+        <w:t xml:space="preserve">Cheapest build: A4988 instead of TMC2208, SG90 instead of MG90S, 17HS4023 motor, skate bearings, no noise board: about $88 total parts.</w:t>
       </w:r>
     </w:p>
     <w:p>
@@ -10385,7 +11252,7 @@
                 <w:sz w:val="18"/>
                 <w:szCs w:val="18"/>
               </w:rPr>
-              <w:t xml:space="preserve">5</w:t>
+              <w:t xml:space="preserve">9</w:t>
             </w:r>
           </w:p>
         </w:tc>
@@ -10414,7 +11281,7 @@
                 <w:sz w:val="18"/>
                 <w:szCs w:val="18"/>
               </w:rPr>
-              <w:t xml:space="preserve">M2 x 8 x4 servo flange, M2 x 12 x1 horn pin</w:t>
+              <w:t xml:space="preserve">M2 x 8 x4 servo flange, M2 x 8 x4 noise board, M2 x 12 x1 horn pin</w:t>
             </w:r>
           </w:p>
         </w:tc>
@@ -10446,7 +11313,7 @@
                 <w:sz w:val="18"/>
                 <w:szCs w:val="18"/>
               </w:rPr>
-              <w:t xml:space="preserve">$0.60</w:t>
+              <w:t xml:space="preserve">$0.90</w:t>
             </w:r>
           </w:p>
         </w:tc>

</xml_diff>